<commit_message>
Add page numbers and finalize report layout
</commit_message>
<xml_diff>
--- a/docs/Mini-Project-Report.docx
+++ b/docs/Mini-Project-Report.docx
@@ -778,7 +778,7 @@
           <w:lang w:val="en"/>
         </w:rPr>
       </w:pPr>
-      <w:bookmarkStart w:id="0" w:name="_Toc244259154"/>
+      <w:bookmarkStart w:id="0" w:name="_Toc244259725"/>
       <w:r>
         <w:rPr>
           <w:rFonts w:eastAsia="Times New Roman"/>
@@ -1095,7 +1095,7 @@
         <w:rPr>
           <w:noProof/>
         </w:rPr>
-        <w:instrText xml:space="preserve"> PAGEREF _Toc244259154 \h </w:instrText>
+        <w:instrText xml:space="preserve"> PAGEREF _Toc244259725 \h </w:instrText>
       </w:r>
       <w:r>
         <w:rPr>
@@ -1159,7 +1159,7 @@
         <w:rPr>
           <w:noProof/>
         </w:rPr>
-        <w:instrText xml:space="preserve"> PAGEREF _Toc244259155 \h </w:instrText>
+        <w:instrText xml:space="preserve"> PAGEREF _Toc244259726 \h </w:instrText>
       </w:r>
       <w:r>
         <w:rPr>
@@ -1223,7 +1223,7 @@
         <w:rPr>
           <w:noProof/>
         </w:rPr>
-        <w:instrText xml:space="preserve"> PAGEREF _Toc244259156 \h </w:instrText>
+        <w:instrText xml:space="preserve"> PAGEREF _Toc244259727 \h </w:instrText>
       </w:r>
       <w:r>
         <w:rPr>
@@ -1287,7 +1287,7 @@
         <w:rPr>
           <w:noProof/>
         </w:rPr>
-        <w:instrText xml:space="preserve"> PAGEREF _Toc244259157 \h </w:instrText>
+        <w:instrText xml:space="preserve"> PAGEREF _Toc244259728 \h </w:instrText>
       </w:r>
       <w:r>
         <w:rPr>
@@ -1351,7 +1351,7 @@
         <w:rPr>
           <w:noProof/>
         </w:rPr>
-        <w:instrText xml:space="preserve"> PAGEREF _Toc244259158 \h </w:instrText>
+        <w:instrText xml:space="preserve"> PAGEREF _Toc244259729 \h </w:instrText>
       </w:r>
       <w:r>
         <w:rPr>
@@ -1415,7 +1415,7 @@
         <w:rPr>
           <w:noProof/>
         </w:rPr>
-        <w:instrText xml:space="preserve"> PAGEREF _Toc244259159 \h </w:instrText>
+        <w:instrText xml:space="preserve"> PAGEREF _Toc244259730 \h </w:instrText>
       </w:r>
       <w:r>
         <w:rPr>
@@ -1479,7 +1479,7 @@
         <w:rPr>
           <w:noProof/>
         </w:rPr>
-        <w:instrText xml:space="preserve"> PAGEREF _Toc244259160 \h </w:instrText>
+        <w:instrText xml:space="preserve"> PAGEREF _Toc244259731 \h </w:instrText>
       </w:r>
       <w:r>
         <w:rPr>
@@ -1543,7 +1543,7 @@
         <w:rPr>
           <w:noProof/>
         </w:rPr>
-        <w:instrText xml:space="preserve"> PAGEREF _Toc244259161 \h </w:instrText>
+        <w:instrText xml:space="preserve"> PAGEREF _Toc244259732 \h </w:instrText>
       </w:r>
       <w:r>
         <w:rPr>
@@ -1607,7 +1607,7 @@
         <w:rPr>
           <w:noProof/>
         </w:rPr>
-        <w:instrText xml:space="preserve"> PAGEREF _Toc244259162 \h </w:instrText>
+        <w:instrText xml:space="preserve"> PAGEREF _Toc244259733 \h </w:instrText>
       </w:r>
       <w:r>
         <w:rPr>
@@ -1671,7 +1671,7 @@
         <w:rPr>
           <w:noProof/>
         </w:rPr>
-        <w:instrText xml:space="preserve"> PAGEREF _Toc244259163 \h </w:instrText>
+        <w:instrText xml:space="preserve"> PAGEREF _Toc244259734 \h </w:instrText>
       </w:r>
       <w:r>
         <w:rPr>
@@ -1735,7 +1735,7 @@
         <w:rPr>
           <w:noProof/>
         </w:rPr>
-        <w:instrText xml:space="preserve"> PAGEREF _Toc244259164 \h </w:instrText>
+        <w:instrText xml:space="preserve"> PAGEREF _Toc244259735 \h </w:instrText>
       </w:r>
       <w:r>
         <w:rPr>
@@ -1799,7 +1799,7 @@
         <w:rPr>
           <w:noProof/>
         </w:rPr>
-        <w:instrText xml:space="preserve"> PAGEREF _Toc244259165 \h </w:instrText>
+        <w:instrText xml:space="preserve"> PAGEREF _Toc244259736 \h </w:instrText>
       </w:r>
       <w:r>
         <w:rPr>
@@ -1863,7 +1863,7 @@
         <w:rPr>
           <w:noProof/>
         </w:rPr>
-        <w:instrText xml:space="preserve"> PAGEREF _Toc244259166 \h </w:instrText>
+        <w:instrText xml:space="preserve"> PAGEREF _Toc244259737 \h </w:instrText>
       </w:r>
       <w:r>
         <w:rPr>
@@ -1927,7 +1927,7 @@
         <w:rPr>
           <w:noProof/>
         </w:rPr>
-        <w:instrText xml:space="preserve"> PAGEREF _Toc244259167 \h </w:instrText>
+        <w:instrText xml:space="preserve"> PAGEREF _Toc244259738 \h </w:instrText>
       </w:r>
       <w:r>
         <w:rPr>
@@ -1991,7 +1991,7 @@
         <w:rPr>
           <w:noProof/>
         </w:rPr>
-        <w:instrText xml:space="preserve"> PAGEREF _Toc244259168 \h </w:instrText>
+        <w:instrText xml:space="preserve"> PAGEREF _Toc244259739 \h </w:instrText>
       </w:r>
       <w:r>
         <w:rPr>
@@ -2055,7 +2055,7 @@
         <w:rPr>
           <w:noProof/>
         </w:rPr>
-        <w:instrText xml:space="preserve"> PAGEREF _Toc244259169 \h </w:instrText>
+        <w:instrText xml:space="preserve"> PAGEREF _Toc244259740 \h </w:instrText>
       </w:r>
       <w:r>
         <w:rPr>
@@ -2119,7 +2119,7 @@
         <w:rPr>
           <w:noProof/>
         </w:rPr>
-        <w:instrText xml:space="preserve"> PAGEREF _Toc244259170 \h </w:instrText>
+        <w:instrText xml:space="preserve"> PAGEREF _Toc244259741 \h </w:instrText>
       </w:r>
       <w:r>
         <w:rPr>
@@ -2183,7 +2183,7 @@
         <w:rPr>
           <w:noProof/>
         </w:rPr>
-        <w:instrText xml:space="preserve"> PAGEREF _Toc244259171 \h </w:instrText>
+        <w:instrText xml:space="preserve"> PAGEREF _Toc244259742 \h </w:instrText>
       </w:r>
       <w:r>
         <w:rPr>
@@ -2247,7 +2247,7 @@
         <w:rPr>
           <w:noProof/>
         </w:rPr>
-        <w:instrText xml:space="preserve"> PAGEREF _Toc244259172 \h </w:instrText>
+        <w:instrText xml:space="preserve"> PAGEREF _Toc244259743 \h </w:instrText>
       </w:r>
       <w:r>
         <w:rPr>
@@ -2311,7 +2311,7 @@
         <w:rPr>
           <w:noProof/>
         </w:rPr>
-        <w:instrText xml:space="preserve"> PAGEREF _Toc244259173 \h </w:instrText>
+        <w:instrText xml:space="preserve"> PAGEREF _Toc244259744 \h </w:instrText>
       </w:r>
       <w:r>
         <w:rPr>
@@ -2375,7 +2375,7 @@
         <w:rPr>
           <w:noProof/>
         </w:rPr>
-        <w:instrText xml:space="preserve"> PAGEREF _Toc244259174 \h </w:instrText>
+        <w:instrText xml:space="preserve"> PAGEREF _Toc244259745 \h </w:instrText>
       </w:r>
       <w:r>
         <w:rPr>
@@ -2439,7 +2439,7 @@
         <w:rPr>
           <w:noProof/>
         </w:rPr>
-        <w:instrText xml:space="preserve"> PAGEREF _Toc244259175 \h </w:instrText>
+        <w:instrText xml:space="preserve"> PAGEREF _Toc244259746 \h </w:instrText>
       </w:r>
       <w:r>
         <w:rPr>
@@ -2503,7 +2503,7 @@
         <w:rPr>
           <w:noProof/>
         </w:rPr>
-        <w:instrText xml:space="preserve"> PAGEREF _Toc244259176 \h </w:instrText>
+        <w:instrText xml:space="preserve"> PAGEREF _Toc244259747 \h </w:instrText>
       </w:r>
       <w:r>
         <w:rPr>
@@ -2567,7 +2567,7 @@
         <w:rPr>
           <w:noProof/>
         </w:rPr>
-        <w:instrText xml:space="preserve"> PAGEREF _Toc244259177 \h </w:instrText>
+        <w:instrText xml:space="preserve"> PAGEREF _Toc244259748 \h </w:instrText>
       </w:r>
       <w:r>
         <w:rPr>
@@ -2631,7 +2631,7 @@
         <w:rPr>
           <w:noProof/>
         </w:rPr>
-        <w:instrText xml:space="preserve"> PAGEREF _Toc244259178 \h </w:instrText>
+        <w:instrText xml:space="preserve"> PAGEREF _Toc244259749 \h </w:instrText>
       </w:r>
       <w:r>
         <w:rPr>
@@ -2695,7 +2695,7 @@
         <w:rPr>
           <w:noProof/>
         </w:rPr>
-        <w:instrText xml:space="preserve"> PAGEREF _Toc244259179 \h </w:instrText>
+        <w:instrText xml:space="preserve"> PAGEREF _Toc244259750 \h </w:instrText>
       </w:r>
       <w:r>
         <w:rPr>
@@ -2759,7 +2759,7 @@
         <w:rPr>
           <w:noProof/>
         </w:rPr>
-        <w:instrText xml:space="preserve"> PAGEREF _Toc244259180 \h </w:instrText>
+        <w:instrText xml:space="preserve"> PAGEREF _Toc244259751 \h </w:instrText>
       </w:r>
       <w:r>
         <w:rPr>
@@ -2823,7 +2823,7 @@
         <w:rPr>
           <w:noProof/>
         </w:rPr>
-        <w:instrText xml:space="preserve"> PAGEREF _Toc244259181 \h </w:instrText>
+        <w:instrText xml:space="preserve"> PAGEREF _Toc244259752 \h </w:instrText>
       </w:r>
       <w:r>
         <w:rPr>
@@ -2887,7 +2887,7 @@
         <w:rPr>
           <w:noProof/>
         </w:rPr>
-        <w:instrText xml:space="preserve"> PAGEREF _Toc244259182 \h </w:instrText>
+        <w:instrText xml:space="preserve"> PAGEREF _Toc244259753 \h </w:instrText>
       </w:r>
       <w:r>
         <w:rPr>
@@ -2951,7 +2951,7 @@
         <w:rPr>
           <w:noProof/>
         </w:rPr>
-        <w:instrText xml:space="preserve"> PAGEREF _Toc244259183 \h </w:instrText>
+        <w:instrText xml:space="preserve"> PAGEREF _Toc244259754 \h </w:instrText>
       </w:r>
       <w:r>
         <w:rPr>
@@ -3015,7 +3015,7 @@
         <w:rPr>
           <w:noProof/>
         </w:rPr>
-        <w:instrText xml:space="preserve"> PAGEREF _Toc244259184 \h </w:instrText>
+        <w:instrText xml:space="preserve"> PAGEREF _Toc244259755 \h </w:instrText>
       </w:r>
       <w:r>
         <w:rPr>
@@ -3079,7 +3079,7 @@
         <w:rPr>
           <w:noProof/>
         </w:rPr>
-        <w:instrText xml:space="preserve"> PAGEREF _Toc244259185 \h </w:instrText>
+        <w:instrText xml:space="preserve"> PAGEREF _Toc244259756 \h </w:instrText>
       </w:r>
       <w:r>
         <w:rPr>
@@ -3128,7 +3128,7 @@
         <w:lastRenderedPageBreak/>
         <w:fldChar w:fldCharType="end"/>
       </w:r>
-      <w:bookmarkStart w:id="1" w:name="_Toc244259155"/>
+      <w:bookmarkStart w:id="1" w:name="_Toc244259726"/>
       <w:r>
         <w:rPr>
           <w:rFonts w:eastAsia="Times New Roman"/>
@@ -3157,7 +3157,7 @@
           <w:lang w:val="en"/>
         </w:rPr>
       </w:pPr>
-      <w:bookmarkStart w:id="2" w:name="_Toc244259156"/>
+      <w:bookmarkStart w:id="2" w:name="_Toc244259727"/>
       <w:r>
         <w:rPr>
           <w:rFonts w:eastAsia="Times New Roman"/>
@@ -5885,7 +5885,7 @@
           <w:lang w:val="en"/>
         </w:rPr>
       </w:pPr>
-      <w:bookmarkStart w:id="3" w:name="_Toc244259157"/>
+      <w:bookmarkStart w:id="3" w:name="_Toc244259728"/>
       <w:r>
         <w:rPr>
           <w:rFonts w:eastAsia="Times New Roman"/>
@@ -6489,7 +6489,7 @@
           <w:lang w:val="en"/>
         </w:rPr>
       </w:pPr>
-      <w:bookmarkStart w:id="4" w:name="_Toc244259158"/>
+      <w:bookmarkStart w:id="4" w:name="_Toc244259729"/>
       <w:r>
         <w:rPr>
           <w:rFonts w:eastAsia="Times New Roman"/>
@@ -8206,7 +8206,7 @@
           <w:lang w:val="en"/>
         </w:rPr>
       </w:pPr>
-      <w:bookmarkStart w:id="5" w:name="_Toc244259159"/>
+      <w:bookmarkStart w:id="5" w:name="_Toc244259730"/>
       <w:r>
         <w:rPr>
           <w:rFonts w:eastAsia="Times New Roman"/>
@@ -10588,7 +10588,7 @@
           <w:lang w:val="en"/>
         </w:rPr>
       </w:pPr>
-      <w:bookmarkStart w:id="6" w:name="_Toc244259160"/>
+      <w:bookmarkStart w:id="6" w:name="_Toc244259731"/>
       <w:r>
         <w:rPr>
           <w:rFonts w:eastAsia="Times New Roman"/>
@@ -12693,7 +12693,7 @@
           <w:lang w:val="en"/>
         </w:rPr>
       </w:pPr>
-      <w:bookmarkStart w:id="7" w:name="_Toc244259161"/>
+      <w:bookmarkStart w:id="7" w:name="_Toc244259732"/>
       <w:r>
         <w:rPr>
           <w:rFonts w:eastAsia="Times New Roman"/>
@@ -13084,7 +13084,7 @@
           <w:lang w:val="en"/>
         </w:rPr>
       </w:pPr>
-      <w:bookmarkStart w:id="8" w:name="_Toc244259162"/>
+      <w:bookmarkStart w:id="8" w:name="_Toc244259733"/>
       <w:r>
         <w:rPr>
           <w:rFonts w:eastAsia="Times New Roman"/>
@@ -15340,7 +15340,7 @@
           <w:lang w:val="en"/>
         </w:rPr>
       </w:pPr>
-      <w:bookmarkStart w:id="9" w:name="_Toc244259163"/>
+      <w:bookmarkStart w:id="9" w:name="_Toc244259734"/>
       <w:r>
         <w:rPr>
           <w:rFonts w:eastAsia="Times New Roman"/>
@@ -15370,7 +15370,7 @@
           <w:lang w:val="en"/>
         </w:rPr>
       </w:pPr>
-      <w:bookmarkStart w:id="10" w:name="_Toc244259164"/>
+      <w:bookmarkStart w:id="10" w:name="_Toc244259735"/>
       <w:r>
         <w:rPr>
           <w:rFonts w:eastAsia="Times New Roman"/>
@@ -17047,7 +17047,7 @@
           <w:lang w:val="en"/>
         </w:rPr>
       </w:pPr>
-      <w:bookmarkStart w:id="11" w:name="_Toc244259165"/>
+      <w:bookmarkStart w:id="11" w:name="_Toc244259736"/>
       <w:r>
         <w:rPr>
           <w:rFonts w:eastAsia="Times New Roman"/>
@@ -17596,7 +17596,7 @@
           <w:lang w:val="en"/>
         </w:rPr>
       </w:pPr>
-      <w:bookmarkStart w:id="12" w:name="_Toc244259166"/>
+      <w:bookmarkStart w:id="12" w:name="_Toc244259737"/>
       <w:r>
         <w:rPr>
           <w:rFonts w:eastAsia="Times New Roman"/>
@@ -19198,7 +19198,7 @@
           <w:lang w:val="en"/>
         </w:rPr>
       </w:pPr>
-      <w:bookmarkStart w:id="13" w:name="_Toc244259167"/>
+      <w:bookmarkStart w:id="13" w:name="_Toc244259738"/>
       <w:r>
         <w:rPr>
           <w:rFonts w:eastAsia="Times New Roman"/>
@@ -20389,7 +20389,7 @@
           <w:lang w:val="en"/>
         </w:rPr>
       </w:pPr>
-      <w:bookmarkStart w:id="14" w:name="_Toc244259168"/>
+      <w:bookmarkStart w:id="14" w:name="_Toc244259739"/>
       <w:r>
         <w:rPr>
           <w:rFonts w:eastAsia="Times New Roman"/>
@@ -21093,7 +21093,7 @@
         </w:rPr>
         <w:lastRenderedPageBreak/>
         <w:drawing>
-          <wp:inline distT="0" distB="0" distL="0" distR="0" wp14:anchorId="6F9DC2DB" wp14:editId="384AB921">
+          <wp:inline distT="0" distB="0" distL="0" distR="0" wp14:anchorId="6F9DC2DB" wp14:editId="5B032DD0">
             <wp:extent cx="5334000" cy="5928360"/>
             <wp:effectExtent l="0" t="0" r="0" b="0"/>
             <wp:docPr id="1" name="Picture 1" descr="Dashboard overview"/>
@@ -21105,196 +21105,6 @@
                 <pic:pic xmlns:pic="http://schemas.openxmlformats.org/drawingml/2006/picture">
                   <pic:nvPicPr>
                     <pic:cNvPr id="0" name="Picture 1" descr="Dashboard overview"/>
-                    <pic:cNvPicPr>
-                      <a:picLocks noChangeAspect="1" noChangeArrowheads="1"/>
-                    </pic:cNvPicPr>
-                  </pic:nvPicPr>
-                  <pic:blipFill>
-                    <a:blip r:embed="rId5" cstate="print">
-                      <a:extLst>
-                        <a:ext uri="{28A0092B-C50C-407E-A947-70E740481C1C}">
-                          <a14:useLocalDpi xmlns:a14="http://schemas.microsoft.com/office/drawing/2010/main" val="0"/>
-                        </a:ext>
-                      </a:extLst>
-                    </a:blip>
-                    <a:srcRect/>
-                    <a:stretch>
-                      <a:fillRect/>
-                    </a:stretch>
-                  </pic:blipFill>
-                  <pic:spPr bwMode="auto">
-                    <a:xfrm>
-                      <a:off x="0" y="0"/>
-                      <a:ext cx="5334000" cy="5928360"/>
-                    </a:xfrm>
-                    <a:prstGeom prst="rect">
-                      <a:avLst/>
-                    </a:prstGeom>
-                    <a:noFill/>
-                    <a:ln>
-                      <a:noFill/>
-                    </a:ln>
-                  </pic:spPr>
-                </pic:pic>
-              </a:graphicData>
-            </a:graphic>
-          </wp:inline>
-        </w:drawing>
-      </w:r>
-    </w:p>
-    <w:p>
-      <w:pPr>
-        <w:jc w:val="center"/>
-        <w:divId w:val="1236743859"/>
-        <w:rPr>
-          <w:rFonts w:eastAsia="Times New Roman"/>
-          <w:i/>
-          <w:iCs/>
-          <w:color w:val="000000"/>
-          <w:sz w:val="21"/>
-          <w:szCs w:val="21"/>
-          <w:lang w:val="en"/>
-        </w:rPr>
-      </w:pPr>
-      <w:r>
-        <w:rPr>
-          <w:rFonts w:eastAsia="Times New Roman"/>
-          <w:i/>
-          <w:iCs/>
-          <w:color w:val="000000"/>
-          <w:sz w:val="21"/>
-          <w:szCs w:val="21"/>
-          <w:lang w:val="en"/>
-        </w:rPr>
-        <w:t>Figure 2.1 – Dashboard overview: stat cards, lot cards, travel-time chip, and simulated clock.</w:t>
-      </w:r>
-    </w:p>
-    <w:p>
-      <w:pPr>
-        <w:jc w:val="center"/>
-        <w:divId w:val="1161390989"/>
-        <w:rPr>
-          <w:rFonts w:eastAsia="Times New Roman"/>
-          <w:color w:val="000000"/>
-          <w:lang w:val="en"/>
-        </w:rPr>
-      </w:pPr>
-      <w:r>
-        <w:rPr>
-          <w:rFonts w:eastAsia="Times New Roman"/>
-          <w:noProof/>
-          <w:color w:val="000000"/>
-          <w:lang w:val="en"/>
-        </w:rPr>
-        <w:lastRenderedPageBreak/>
-        <w:drawing>
-          <wp:inline distT="0" distB="0" distL="0" distR="0" wp14:anchorId="1F59DBB2" wp14:editId="307CA174">
-            <wp:extent cx="5334000" cy="5928360"/>
-            <wp:effectExtent l="0" t="0" r="0" b="0"/>
-            <wp:docPr id="2" name="Picture 2" descr="Lot cards"/>
-            <wp:cNvGraphicFramePr>
-              <a:graphicFrameLocks xmlns:a="http://schemas.openxmlformats.org/drawingml/2006/main" noChangeAspect="1"/>
-            </wp:cNvGraphicFramePr>
-            <a:graphic xmlns:a="http://schemas.openxmlformats.org/drawingml/2006/main">
-              <a:graphicData uri="http://schemas.openxmlformats.org/drawingml/2006/picture">
-                <pic:pic xmlns:pic="http://schemas.openxmlformats.org/drawingml/2006/picture">
-                  <pic:nvPicPr>
-                    <pic:cNvPr id="0" name="Picture 2" descr="Lot cards"/>
-                    <pic:cNvPicPr>
-                      <a:picLocks noChangeAspect="1" noChangeArrowheads="1"/>
-                    </pic:cNvPicPr>
-                  </pic:nvPicPr>
-                  <pic:blipFill>
-                    <a:blip r:embed="rId6" cstate="print">
-                      <a:extLst>
-                        <a:ext uri="{28A0092B-C50C-407E-A947-70E740481C1C}">
-                          <a14:useLocalDpi xmlns:a14="http://schemas.microsoft.com/office/drawing/2010/main" val="0"/>
-                        </a:ext>
-                      </a:extLst>
-                    </a:blip>
-                    <a:srcRect/>
-                    <a:stretch>
-                      <a:fillRect/>
-                    </a:stretch>
-                  </pic:blipFill>
-                  <pic:spPr bwMode="auto">
-                    <a:xfrm>
-                      <a:off x="0" y="0"/>
-                      <a:ext cx="5334000" cy="5928360"/>
-                    </a:xfrm>
-                    <a:prstGeom prst="rect">
-                      <a:avLst/>
-                    </a:prstGeom>
-                    <a:noFill/>
-                    <a:ln>
-                      <a:noFill/>
-                    </a:ln>
-                  </pic:spPr>
-                </pic:pic>
-              </a:graphicData>
-            </a:graphic>
-          </wp:inline>
-        </w:drawing>
-      </w:r>
-    </w:p>
-    <w:p>
-      <w:pPr>
-        <w:jc w:val="center"/>
-        <w:divId w:val="521629799"/>
-        <w:rPr>
-          <w:rFonts w:eastAsia="Times New Roman"/>
-          <w:i/>
-          <w:iCs/>
-          <w:color w:val="000000"/>
-          <w:sz w:val="21"/>
-          <w:szCs w:val="21"/>
-          <w:lang w:val="en"/>
-        </w:rPr>
-      </w:pPr>
-      <w:r>
-        <w:rPr>
-          <w:rFonts w:eastAsia="Times New Roman"/>
-          <w:i/>
-          <w:iCs/>
-          <w:color w:val="000000"/>
-          <w:sz w:val="21"/>
-          <w:szCs w:val="21"/>
-          <w:lang w:val="en"/>
-        </w:rPr>
-        <w:t>Figure 2.2 – Lot cards showing capacity, travel time, and available/reserved/occupied counts.</w:t>
-      </w:r>
-    </w:p>
-    <w:p>
-      <w:pPr>
-        <w:jc w:val="center"/>
-        <w:divId w:val="2130198643"/>
-        <w:rPr>
-          <w:rFonts w:eastAsia="Times New Roman"/>
-          <w:color w:val="000000"/>
-          <w:lang w:val="en"/>
-        </w:rPr>
-      </w:pPr>
-      <w:r>
-        <w:rPr>
-          <w:rFonts w:eastAsia="Times New Roman"/>
-          <w:noProof/>
-          <w:color w:val="000000"/>
-          <w:lang w:val="en"/>
-        </w:rPr>
-        <w:lastRenderedPageBreak/>
-        <w:drawing>
-          <wp:inline distT="0" distB="0" distL="0" distR="0" wp14:anchorId="2B0F9BEA" wp14:editId="774F18F0">
-            <wp:extent cx="5334000" cy="5928360"/>
-            <wp:effectExtent l="0" t="0" r="0" b="0"/>
-            <wp:docPr id="3" name="Picture 3" descr="Space grid"/>
-            <wp:cNvGraphicFramePr>
-              <a:graphicFrameLocks xmlns:a="http://schemas.openxmlformats.org/drawingml/2006/main" noChangeAspect="1"/>
-            </wp:cNvGraphicFramePr>
-            <a:graphic xmlns:a="http://schemas.openxmlformats.org/drawingml/2006/main">
-              <a:graphicData uri="http://schemas.openxmlformats.org/drawingml/2006/picture">
-                <pic:pic xmlns:pic="http://schemas.openxmlformats.org/drawingml/2006/picture">
-                  <pic:nvPicPr>
-                    <pic:cNvPr id="0" name="Picture 3" descr="Space grid"/>
                     <pic:cNvPicPr>
                       <a:picLocks noChangeAspect="1" noChangeArrowheads="1"/>
                     </pic:cNvPicPr>
@@ -21335,7 +21145,7 @@
     <w:p>
       <w:pPr>
         <w:jc w:val="center"/>
-        <w:divId w:val="826172506"/>
+        <w:divId w:val="1236743859"/>
         <w:rPr>
           <w:rFonts w:eastAsia="Times New Roman"/>
           <w:i/>
@@ -21356,13 +21166,13 @@
           <w:szCs w:val="21"/>
           <w:lang w:val="en"/>
         </w:rPr>
-        <w:t>Figure 2.3 – Visual space grid with lot, type, floor, permit requirement, and status filters.</w:t>
+        <w:t>Figure 2.1 – Dashboard overview: stat cards, lot cards, travel-time chip, and simulated clock.</w:t>
       </w:r>
     </w:p>
     <w:p>
       <w:pPr>
         <w:jc w:val="center"/>
-        <w:divId w:val="1878007200"/>
+        <w:divId w:val="1161390989"/>
         <w:rPr>
           <w:rFonts w:eastAsia="Times New Roman"/>
           <w:color w:val="000000"/>
@@ -21378,10 +21188,10 @@
         </w:rPr>
         <w:lastRenderedPageBreak/>
         <w:drawing>
-          <wp:inline distT="0" distB="0" distL="0" distR="0" wp14:anchorId="0F188D01" wp14:editId="4C1C5E01">
+          <wp:inline distT="0" distB="0" distL="0" distR="0" wp14:anchorId="1F59DBB2" wp14:editId="78291478">
             <wp:extent cx="5334000" cy="5928360"/>
             <wp:effectExtent l="0" t="0" r="0" b="0"/>
-            <wp:docPr id="4" name="Picture 4" descr="Vehicle registration and directory"/>
+            <wp:docPr id="2" name="Picture 2" descr="Lot cards"/>
             <wp:cNvGraphicFramePr>
               <a:graphicFrameLocks xmlns:a="http://schemas.openxmlformats.org/drawingml/2006/main" noChangeAspect="1"/>
             </wp:cNvGraphicFramePr>
@@ -21389,7 +21199,7 @@
               <a:graphicData uri="http://schemas.openxmlformats.org/drawingml/2006/picture">
                 <pic:pic xmlns:pic="http://schemas.openxmlformats.org/drawingml/2006/picture">
                   <pic:nvPicPr>
-                    <pic:cNvPr id="0" name="Picture 4" descr="Vehicle registration and directory"/>
+                    <pic:cNvPr id="0" name="Picture 2" descr="Lot cards"/>
                     <pic:cNvPicPr>
                       <a:picLocks noChangeAspect="1" noChangeArrowheads="1"/>
                     </pic:cNvPicPr>
@@ -21430,7 +21240,7 @@
     <w:p>
       <w:pPr>
         <w:jc w:val="center"/>
-        <w:divId w:val="522405202"/>
+        <w:divId w:val="521629799"/>
         <w:rPr>
           <w:rFonts w:eastAsia="Times New Roman"/>
           <w:i/>
@@ -21451,13 +21261,13 @@
           <w:szCs w:val="21"/>
           <w:lang w:val="en"/>
         </w:rPr>
-        <w:t>Figure 2.4 – Vehicle registration form and searchable vehicle directory.</w:t>
+        <w:t>Figure 2.2 – Lot cards showing capacity, travel time, and available/reserved/occupied counts.</w:t>
       </w:r>
     </w:p>
     <w:p>
       <w:pPr>
         <w:jc w:val="center"/>
-        <w:divId w:val="1999263518"/>
+        <w:divId w:val="2130198643"/>
         <w:rPr>
           <w:rFonts w:eastAsia="Times New Roman"/>
           <w:color w:val="000000"/>
@@ -21473,10 +21283,10 @@
         </w:rPr>
         <w:lastRenderedPageBreak/>
         <w:drawing>
-          <wp:inline distT="0" distB="0" distL="0" distR="0" wp14:anchorId="0356C053" wp14:editId="48B7BEB7">
+          <wp:inline distT="0" distB="0" distL="0" distR="0" wp14:anchorId="2B0F9BEA" wp14:editId="0A8DACC1">
             <wp:extent cx="5334000" cy="5928360"/>
             <wp:effectExtent l="0" t="0" r="0" b="0"/>
-            <wp:docPr id="5" name="Picture 5" descr="Reservation form and table"/>
+            <wp:docPr id="3" name="Picture 3" descr="Space grid"/>
             <wp:cNvGraphicFramePr>
               <a:graphicFrameLocks xmlns:a="http://schemas.openxmlformats.org/drawingml/2006/main" noChangeAspect="1"/>
             </wp:cNvGraphicFramePr>
@@ -21484,7 +21294,7 @@
               <a:graphicData uri="http://schemas.openxmlformats.org/drawingml/2006/picture">
                 <pic:pic xmlns:pic="http://schemas.openxmlformats.org/drawingml/2006/picture">
                   <pic:nvPicPr>
-                    <pic:cNvPr id="0" name="Picture 5" descr="Reservation form and table"/>
+                    <pic:cNvPr id="0" name="Picture 3" descr="Space grid"/>
                     <pic:cNvPicPr>
                       <a:picLocks noChangeAspect="1" noChangeArrowheads="1"/>
                     </pic:cNvPicPr>
@@ -21525,7 +21335,7 @@
     <w:p>
       <w:pPr>
         <w:jc w:val="center"/>
-        <w:divId w:val="541594778"/>
+        <w:divId w:val="826172506"/>
         <w:rPr>
           <w:rFonts w:eastAsia="Times New Roman"/>
           <w:i/>
@@ -21546,13 +21356,13 @@
           <w:szCs w:val="21"/>
           <w:lang w:val="en"/>
         </w:rPr>
-        <w:t>Figure 2.5 – Reservation form with optional preferred space and the reservation action table.</w:t>
+        <w:t>Figure 2.3 – Visual space grid with lot, type, floor, permit requirement, and status filters.</w:t>
       </w:r>
     </w:p>
     <w:p>
       <w:pPr>
         <w:jc w:val="center"/>
-        <w:divId w:val="1253588676"/>
+        <w:divId w:val="1878007200"/>
         <w:rPr>
           <w:rFonts w:eastAsia="Times New Roman"/>
           <w:color w:val="000000"/>
@@ -21568,10 +21378,10 @@
         </w:rPr>
         <w:lastRenderedPageBreak/>
         <w:drawing>
-          <wp:inline distT="0" distB="0" distL="0" distR="0" wp14:anchorId="1BAE2E22" wp14:editId="68881C6F">
+          <wp:inline distT="0" distB="0" distL="0" distR="0" wp14:anchorId="0F188D01" wp14:editId="42712B0F">
             <wp:extent cx="5334000" cy="5928360"/>
             <wp:effectExtent l="0" t="0" r="0" b="0"/>
-            <wp:docPr id="6" name="Picture 6" descr="Waiting list"/>
+            <wp:docPr id="4" name="Picture 4" descr="Vehicle registration and directory"/>
             <wp:cNvGraphicFramePr>
               <a:graphicFrameLocks xmlns:a="http://schemas.openxmlformats.org/drawingml/2006/main" noChangeAspect="1"/>
             </wp:cNvGraphicFramePr>
@@ -21579,7 +21389,7 @@
               <a:graphicData uri="http://schemas.openxmlformats.org/drawingml/2006/picture">
                 <pic:pic xmlns:pic="http://schemas.openxmlformats.org/drawingml/2006/picture">
                   <pic:nvPicPr>
-                    <pic:cNvPr id="0" name="Picture 6" descr="Waiting list"/>
+                    <pic:cNvPr id="0" name="Picture 4" descr="Vehicle registration and directory"/>
                     <pic:cNvPicPr>
                       <a:picLocks noChangeAspect="1" noChangeArrowheads="1"/>
                     </pic:cNvPicPr>
@@ -21620,7 +21430,7 @@
     <w:p>
       <w:pPr>
         <w:jc w:val="center"/>
-        <w:divId w:val="762804431"/>
+        <w:divId w:val="522405202"/>
         <w:rPr>
           <w:rFonts w:eastAsia="Times New Roman"/>
           <w:i/>
@@ -21641,13 +21451,13 @@
           <w:szCs w:val="21"/>
           <w:lang w:val="en"/>
         </w:rPr>
-        <w:t>Figure 2.6 – Priority waiting list with position and access-priority badges.</w:t>
+        <w:t>Figure 2.4 – Vehicle registration form and searchable vehicle directory.</w:t>
       </w:r>
     </w:p>
     <w:p>
       <w:pPr>
         <w:jc w:val="center"/>
-        <w:divId w:val="1825199879"/>
+        <w:divId w:val="1999263518"/>
         <w:rPr>
           <w:rFonts w:eastAsia="Times New Roman"/>
           <w:color w:val="000000"/>
@@ -21663,10 +21473,10 @@
         </w:rPr>
         <w:lastRenderedPageBreak/>
         <w:drawing>
-          <wp:inline distT="0" distB="0" distL="0" distR="0" wp14:anchorId="3D93F020" wp14:editId="3037D236">
+          <wp:inline distT="0" distB="0" distL="0" distR="0" wp14:anchorId="0356C053" wp14:editId="28F7B896">
             <wp:extent cx="5334000" cy="5928360"/>
             <wp:effectExtent l="0" t="0" r="0" b="0"/>
-            <wp:docPr id="7" name="Picture 7" descr="Parking history"/>
+            <wp:docPr id="5" name="Picture 5" descr="Reservation form and table"/>
             <wp:cNvGraphicFramePr>
               <a:graphicFrameLocks xmlns:a="http://schemas.openxmlformats.org/drawingml/2006/main" noChangeAspect="1"/>
             </wp:cNvGraphicFramePr>
@@ -21674,7 +21484,7 @@
               <a:graphicData uri="http://schemas.openxmlformats.org/drawingml/2006/picture">
                 <pic:pic xmlns:pic="http://schemas.openxmlformats.org/drawingml/2006/picture">
                   <pic:nvPicPr>
-                    <pic:cNvPr id="0" name="Picture 7" descr="Parking history"/>
+                    <pic:cNvPr id="0" name="Picture 5" descr="Reservation form and table"/>
                     <pic:cNvPicPr>
                       <a:picLocks noChangeAspect="1" noChangeArrowheads="1"/>
                     </pic:cNvPicPr>
@@ -21715,6 +21525,196 @@
     <w:p>
       <w:pPr>
         <w:jc w:val="center"/>
+        <w:divId w:val="541594778"/>
+        <w:rPr>
+          <w:rFonts w:eastAsia="Times New Roman"/>
+          <w:i/>
+          <w:iCs/>
+          <w:color w:val="000000"/>
+          <w:sz w:val="21"/>
+          <w:szCs w:val="21"/>
+          <w:lang w:val="en"/>
+        </w:rPr>
+      </w:pPr>
+      <w:r>
+        <w:rPr>
+          <w:rFonts w:eastAsia="Times New Roman"/>
+          <w:i/>
+          <w:iCs/>
+          <w:color w:val="000000"/>
+          <w:sz w:val="21"/>
+          <w:szCs w:val="21"/>
+          <w:lang w:val="en"/>
+        </w:rPr>
+        <w:t>Figure 2.5 – Reservation form with optional preferred space and the reservation action table.</w:t>
+      </w:r>
+    </w:p>
+    <w:p>
+      <w:pPr>
+        <w:jc w:val="center"/>
+        <w:divId w:val="1253588676"/>
+        <w:rPr>
+          <w:rFonts w:eastAsia="Times New Roman"/>
+          <w:color w:val="000000"/>
+          <w:lang w:val="en"/>
+        </w:rPr>
+      </w:pPr>
+      <w:r>
+        <w:rPr>
+          <w:rFonts w:eastAsia="Times New Roman"/>
+          <w:noProof/>
+          <w:color w:val="000000"/>
+          <w:lang w:val="en"/>
+        </w:rPr>
+        <w:lastRenderedPageBreak/>
+        <w:drawing>
+          <wp:inline distT="0" distB="0" distL="0" distR="0" wp14:anchorId="1BAE2E22" wp14:editId="6A03A5AC">
+            <wp:extent cx="5334000" cy="5928360"/>
+            <wp:effectExtent l="0" t="0" r="0" b="0"/>
+            <wp:docPr id="6" name="Picture 6" descr="Waiting list"/>
+            <wp:cNvGraphicFramePr>
+              <a:graphicFrameLocks xmlns:a="http://schemas.openxmlformats.org/drawingml/2006/main" noChangeAspect="1"/>
+            </wp:cNvGraphicFramePr>
+            <a:graphic xmlns:a="http://schemas.openxmlformats.org/drawingml/2006/main">
+              <a:graphicData uri="http://schemas.openxmlformats.org/drawingml/2006/picture">
+                <pic:pic xmlns:pic="http://schemas.openxmlformats.org/drawingml/2006/picture">
+                  <pic:nvPicPr>
+                    <pic:cNvPr id="0" name="Picture 6" descr="Waiting list"/>
+                    <pic:cNvPicPr>
+                      <a:picLocks noChangeAspect="1" noChangeArrowheads="1"/>
+                    </pic:cNvPicPr>
+                  </pic:nvPicPr>
+                  <pic:blipFill>
+                    <a:blip r:embed="rId12" cstate="print">
+                      <a:extLst>
+                        <a:ext uri="{28A0092B-C50C-407E-A947-70E740481C1C}">
+                          <a14:useLocalDpi xmlns:a14="http://schemas.microsoft.com/office/drawing/2010/main" val="0"/>
+                        </a:ext>
+                      </a:extLst>
+                    </a:blip>
+                    <a:srcRect/>
+                    <a:stretch>
+                      <a:fillRect/>
+                    </a:stretch>
+                  </pic:blipFill>
+                  <pic:spPr bwMode="auto">
+                    <a:xfrm>
+                      <a:off x="0" y="0"/>
+                      <a:ext cx="5334000" cy="5928360"/>
+                    </a:xfrm>
+                    <a:prstGeom prst="rect">
+                      <a:avLst/>
+                    </a:prstGeom>
+                    <a:noFill/>
+                    <a:ln>
+                      <a:noFill/>
+                    </a:ln>
+                  </pic:spPr>
+                </pic:pic>
+              </a:graphicData>
+            </a:graphic>
+          </wp:inline>
+        </w:drawing>
+      </w:r>
+    </w:p>
+    <w:p>
+      <w:pPr>
+        <w:jc w:val="center"/>
+        <w:divId w:val="762804431"/>
+        <w:rPr>
+          <w:rFonts w:eastAsia="Times New Roman"/>
+          <w:i/>
+          <w:iCs/>
+          <w:color w:val="000000"/>
+          <w:sz w:val="21"/>
+          <w:szCs w:val="21"/>
+          <w:lang w:val="en"/>
+        </w:rPr>
+      </w:pPr>
+      <w:r>
+        <w:rPr>
+          <w:rFonts w:eastAsia="Times New Roman"/>
+          <w:i/>
+          <w:iCs/>
+          <w:color w:val="000000"/>
+          <w:sz w:val="21"/>
+          <w:szCs w:val="21"/>
+          <w:lang w:val="en"/>
+        </w:rPr>
+        <w:t>Figure 2.6 – Priority waiting list with position and access-priority badges.</w:t>
+      </w:r>
+    </w:p>
+    <w:p>
+      <w:pPr>
+        <w:jc w:val="center"/>
+        <w:divId w:val="1825199879"/>
+        <w:rPr>
+          <w:rFonts w:eastAsia="Times New Roman"/>
+          <w:color w:val="000000"/>
+          <w:lang w:val="en"/>
+        </w:rPr>
+      </w:pPr>
+      <w:r>
+        <w:rPr>
+          <w:rFonts w:eastAsia="Times New Roman"/>
+          <w:noProof/>
+          <w:color w:val="000000"/>
+          <w:lang w:val="en"/>
+        </w:rPr>
+        <w:lastRenderedPageBreak/>
+        <w:drawing>
+          <wp:inline distT="0" distB="0" distL="0" distR="0" wp14:anchorId="3D93F020" wp14:editId="4811B2C2">
+            <wp:extent cx="5334000" cy="5928360"/>
+            <wp:effectExtent l="0" t="0" r="0" b="0"/>
+            <wp:docPr id="7" name="Picture 7" descr="Parking history"/>
+            <wp:cNvGraphicFramePr>
+              <a:graphicFrameLocks xmlns:a="http://schemas.openxmlformats.org/drawingml/2006/main" noChangeAspect="1"/>
+            </wp:cNvGraphicFramePr>
+            <a:graphic xmlns:a="http://schemas.openxmlformats.org/drawingml/2006/main">
+              <a:graphicData uri="http://schemas.openxmlformats.org/drawingml/2006/picture">
+                <pic:pic xmlns:pic="http://schemas.openxmlformats.org/drawingml/2006/picture">
+                  <pic:nvPicPr>
+                    <pic:cNvPr id="0" name="Picture 7" descr="Parking history"/>
+                    <pic:cNvPicPr>
+                      <a:picLocks noChangeAspect="1" noChangeArrowheads="1"/>
+                    </pic:cNvPicPr>
+                  </pic:nvPicPr>
+                  <pic:blipFill>
+                    <a:blip r:embed="rId13" cstate="print">
+                      <a:extLst>
+                        <a:ext uri="{28A0092B-C50C-407E-A947-70E740481C1C}">
+                          <a14:useLocalDpi xmlns:a14="http://schemas.microsoft.com/office/drawing/2010/main" val="0"/>
+                        </a:ext>
+                      </a:extLst>
+                    </a:blip>
+                    <a:srcRect/>
+                    <a:stretch>
+                      <a:fillRect/>
+                    </a:stretch>
+                  </pic:blipFill>
+                  <pic:spPr bwMode="auto">
+                    <a:xfrm>
+                      <a:off x="0" y="0"/>
+                      <a:ext cx="5334000" cy="5928360"/>
+                    </a:xfrm>
+                    <a:prstGeom prst="rect">
+                      <a:avLst/>
+                    </a:prstGeom>
+                    <a:noFill/>
+                    <a:ln>
+                      <a:noFill/>
+                    </a:ln>
+                  </pic:spPr>
+                </pic:pic>
+              </a:graphicData>
+            </a:graphic>
+          </wp:inline>
+        </w:drawing>
+      </w:r>
+    </w:p>
+    <w:p>
+      <w:pPr>
+        <w:jc w:val="center"/>
         <w:divId w:val="1989893313"/>
         <w:rPr>
           <w:rFonts w:eastAsia="Times New Roman"/>
@@ -22415,7 +22415,7 @@
           <w:lang w:val="en"/>
         </w:rPr>
       </w:pPr>
-      <w:bookmarkStart w:id="15" w:name="_Toc244259169"/>
+      <w:bookmarkStart w:id="15" w:name="_Toc244259740"/>
       <w:r>
         <w:rPr>
           <w:rFonts w:eastAsia="Times New Roman"/>
@@ -22445,7 +22445,7 @@
           <w:lang w:val="en"/>
         </w:rPr>
       </w:pPr>
-      <w:bookmarkStart w:id="16" w:name="_Toc244259170"/>
+      <w:bookmarkStart w:id="16" w:name="_Toc244259741"/>
       <w:r>
         <w:rPr>
           <w:rFonts w:eastAsia="Times New Roman"/>
@@ -28086,7 +28086,7 @@
           <w:lang w:val="en"/>
         </w:rPr>
       </w:pPr>
-      <w:bookmarkStart w:id="17" w:name="_Toc244259171"/>
+      <w:bookmarkStart w:id="17" w:name="_Toc244259742"/>
       <w:r>
         <w:rPr>
           <w:rFonts w:eastAsia="Times New Roman"/>
@@ -28924,7 +28924,7 @@
           <w:lang w:val="en"/>
         </w:rPr>
       </w:pPr>
-      <w:bookmarkStart w:id="18" w:name="_Toc244259172"/>
+      <w:bookmarkStart w:id="18" w:name="_Toc244259743"/>
       <w:r>
         <w:rPr>
           <w:rFonts w:eastAsia="Times New Roman"/>
@@ -29937,7 +29937,7 @@
           <w:lang w:val="en"/>
         </w:rPr>
       </w:pPr>
-      <w:bookmarkStart w:id="19" w:name="_Toc244259173"/>
+      <w:bookmarkStart w:id="19" w:name="_Toc244259744"/>
       <w:r>
         <w:rPr>
           <w:rFonts w:eastAsia="Times New Roman"/>
@@ -31155,7 +31155,7 @@
           <w:lang w:val="en"/>
         </w:rPr>
       </w:pPr>
-      <w:bookmarkStart w:id="20" w:name="_Toc244259174"/>
+      <w:bookmarkStart w:id="20" w:name="_Toc244259745"/>
       <w:r>
         <w:rPr>
           <w:rFonts w:eastAsia="Times New Roman"/>
@@ -31185,7 +31185,7 @@
           <w:lang w:val="en"/>
         </w:rPr>
       </w:pPr>
-      <w:bookmarkStart w:id="21" w:name="_Toc244259175"/>
+      <w:bookmarkStart w:id="21" w:name="_Toc244259746"/>
       <w:r>
         <w:rPr>
           <w:rFonts w:eastAsia="Times New Roman"/>
@@ -32807,7 +32807,7 @@
           <w:lang w:val="en"/>
         </w:rPr>
       </w:pPr>
-      <w:bookmarkStart w:id="22" w:name="_Toc244259176"/>
+      <w:bookmarkStart w:id="22" w:name="_Toc244259747"/>
       <w:r>
         <w:rPr>
           <w:rFonts w:eastAsia="Times New Roman"/>
@@ -32997,7 +32997,7 @@
           <w:lang w:val="en"/>
         </w:rPr>
       </w:pPr>
-      <w:bookmarkStart w:id="23" w:name="_Toc244259177"/>
+      <w:bookmarkStart w:id="23" w:name="_Toc244259748"/>
       <w:r>
         <w:rPr>
           <w:rFonts w:eastAsia="Times New Roman"/>
@@ -33393,7 +33393,7 @@
           <w:lang w:val="en"/>
         </w:rPr>
       </w:pPr>
-      <w:bookmarkStart w:id="24" w:name="_Toc244259178"/>
+      <w:bookmarkStart w:id="24" w:name="_Toc244259749"/>
       <w:r>
         <w:rPr>
           <w:rFonts w:eastAsia="Times New Roman"/>
@@ -33414,7 +33414,7 @@
           <w:lang w:val="en"/>
         </w:rPr>
       </w:pPr>
-      <w:bookmarkStart w:id="25" w:name="_Toc244259179"/>
+      <w:bookmarkStart w:id="25" w:name="_Toc244259750"/>
       <w:r>
         <w:rPr>
           <w:rFonts w:eastAsia="Times New Roman"/>
@@ -33701,7 +33701,7 @@
           <w:lang w:val="en"/>
         </w:rPr>
       </w:pPr>
-      <w:bookmarkStart w:id="26" w:name="_Toc244259180"/>
+      <w:bookmarkStart w:id="26" w:name="_Toc244259751"/>
       <w:r>
         <w:rPr>
           <w:rFonts w:eastAsia="Times New Roman"/>
@@ -34172,7 +34172,7 @@
           <w:lang w:val="en"/>
         </w:rPr>
       </w:pPr>
-      <w:bookmarkStart w:id="27" w:name="_Toc244259181"/>
+      <w:bookmarkStart w:id="27" w:name="_Toc244259752"/>
       <w:r>
         <w:rPr>
           <w:rFonts w:eastAsia="Times New Roman"/>
@@ -34240,7 +34240,7 @@
           <w:lang w:val="en"/>
         </w:rPr>
       </w:pPr>
-      <w:bookmarkStart w:id="28" w:name="_Toc244259182"/>
+      <w:bookmarkStart w:id="28" w:name="_Toc244259753"/>
       <w:r>
         <w:rPr>
           <w:rFonts w:eastAsia="Times New Roman"/>
@@ -34405,7 +34405,7 @@
           <w:lang w:val="en"/>
         </w:rPr>
       </w:pPr>
-      <w:bookmarkStart w:id="29" w:name="_Toc244259183"/>
+      <w:bookmarkStart w:id="29" w:name="_Toc244259754"/>
       <w:r>
         <w:rPr>
           <w:rFonts w:eastAsia="Times New Roman"/>
@@ -34569,7 +34569,7 @@
           <w:lang w:val="en"/>
         </w:rPr>
       </w:pPr>
-      <w:bookmarkStart w:id="30" w:name="_Toc244259184"/>
+      <w:bookmarkStart w:id="30" w:name="_Toc244259755"/>
       <w:r>
         <w:rPr>
           <w:rFonts w:eastAsia="Times New Roman"/>
@@ -34958,7 +34958,7 @@
           <w:lang w:val="en"/>
         </w:rPr>
       </w:pPr>
-      <w:bookmarkStart w:id="31" w:name="_Toc244259185"/>
+      <w:bookmarkStart w:id="31" w:name="_Toc244259756"/>
       <w:r>
         <w:rPr>
           <w:rFonts w:eastAsia="Times New Roman"/>
@@ -35091,13 +35091,153 @@
       </w:r>
     </w:p>
     <w:sectPr>
+      <w:headerReference w:type="even" r:id="rId14"/>
+      <w:headerReference w:type="default" r:id="rId15"/>
+      <w:footerReference w:type="even" r:id="rId16"/>
+      <w:footerReference w:type="default" r:id="rId17"/>
+      <w:headerReference w:type="first" r:id="rId18"/>
+      <w:footerReference w:type="first" r:id="rId19"/>
       <w:pgSz w:w="11906" w:h="16838"/>
       <w:pgMar w:top="1440" w:right="1298" w:bottom="1440" w:left="1298" w:header="708" w:footer="708" w:gutter="0"/>
       <w:cols w:space="708"/>
+      <w:titlePg/>
       <w:docGrid w:linePitch="360"/>
     </w:sectPr>
   </w:body>
 </w:document>
+</file>
+
+<file path=word/endnotes.xml><?xml version="1.0" encoding="utf-8"?>
+<w:endnotes xmlns:wpc="http://schemas.microsoft.com/office/word/2010/wordprocessingCanvas" xmlns:cx="http://schemas.microsoft.com/office/drawing/2014/chartex" xmlns:cx1="http://schemas.microsoft.com/office/drawing/2015/9/8/chartex" xmlns:cx2="http://schemas.microsoft.com/office/drawing/2015/10/21/chartex" xmlns:cx3="http://schemas.microsoft.com/office/drawing/2016/5/9/chartex" xmlns:cx4="http://schemas.microsoft.com/office/drawing/2016/5/10/chartex" xmlns:cx5="http://schemas.microsoft.com/office/drawing/2016/5/11/chartex" xmlns:cx6="http://schemas.microsoft.com/office/drawing/2016/5/12/chartex" xmlns:cx7="http://schemas.microsoft.com/office/drawing/2016/5/13/chartex" xmlns:cx8="http://schemas.microsoft.com/office/drawing/2016/5/14/chartex" xmlns:mc="http://schemas.openxmlformats.org/markup-compatibility/2006" xmlns:aink="http://schemas.microsoft.com/office/drawing/2016/ink" xmlns:am3d="http://schemas.microsoft.com/office/drawing/2017/model3d" xmlns:o="urn:schemas-microsoft-com:office:office" xmlns:oel="http://schemas.microsoft.com/office/2019/extlst" xmlns:r="http://schemas.openxmlformats.org/officeDocument/2006/relationships" xmlns:m="http://schemas.openxmlformats.org/officeDocument/2006/math" xmlns:v="urn:schemas-microsoft-com:vml" xmlns:wp14="http://schemas.microsoft.com/office/word/2010/wordprocessingDrawing" xmlns:wp="http://schemas.openxmlformats.org/drawingml/2006/wordprocessingDrawing" xmlns:w10="urn:schemas-microsoft-com:office:word" xmlns:w="http://schemas.openxmlformats.org/wordprocessingml/2006/main" xmlns:w14="http://schemas.microsoft.com/office/word/2010/wordml" xmlns:w15="http://schemas.microsoft.com/office/word/2012/wordml" xmlns:w16cex="http://schemas.microsoft.com/office/word/2018/wordml/cex" xmlns:w16cid="http://schemas.microsoft.com/office/word/2016/wordml/cid" xmlns:w16="http://schemas.microsoft.com/office/word/2018/wordml" xmlns:w16du="http://schemas.microsoft.com/office/word/2023/wordml/word16du" xmlns:w16sdtdh="http://schemas.microsoft.com/office/word/2020/wordml/sdtdatahash" xmlns:w16sdtfl="http://schemas.microsoft.com/office/word/2024/wordml/sdtformatlock" xmlns:w16se="http://schemas.microsoft.com/office/word/2015/wordml/symex" xmlns:wpg="http://schemas.microsoft.com/office/word/2010/wordprocessingGroup" xmlns:wpi="http://schemas.microsoft.com/office/word/2010/wordprocessingInk" xmlns:wne="http://schemas.microsoft.com/office/word/2006/wordml" xmlns:wps="http://schemas.microsoft.com/office/word/2010/wordprocessingShape" mc:Ignorable="w14 w15 w16se w16cid w16 w16cex w16sdtdh w16sdtfl w16du wp14">
+  <w:endnote w:type="separator" w:id="-1">
+    <w:p>
+      <w:r>
+        <w:separator/>
+      </w:r>
+    </w:p>
+  </w:endnote>
+  <w:endnote w:type="continuationSeparator" w:id="0">
+    <w:p>
+      <w:r>
+        <w:continuationSeparator/>
+      </w:r>
+    </w:p>
+  </w:endnote>
+</w:endnotes>
+</file>
+
+<file path=word/footer1.xml><?xml version="1.0" encoding="utf-8"?>
+<w:ftr xmlns:wpc="http://schemas.microsoft.com/office/word/2010/wordprocessingCanvas" xmlns:cx="http://schemas.microsoft.com/office/drawing/2014/chartex" xmlns:cx1="http://schemas.microsoft.com/office/drawing/2015/9/8/chartex" xmlns:cx2="http://schemas.microsoft.com/office/drawing/2015/10/21/chartex" xmlns:cx3="http://schemas.microsoft.com/office/drawing/2016/5/9/chartex" xmlns:cx4="http://schemas.microsoft.com/office/drawing/2016/5/10/chartex" xmlns:cx5="http://schemas.microsoft.com/office/drawing/2016/5/11/chartex" xmlns:cx6="http://schemas.microsoft.com/office/drawing/2016/5/12/chartex" xmlns:cx7="http://schemas.microsoft.com/office/drawing/2016/5/13/chartex" xmlns:cx8="http://schemas.microsoft.com/office/drawing/2016/5/14/chartex" xmlns:mc="http://schemas.openxmlformats.org/markup-compatibility/2006" xmlns:aink="http://schemas.microsoft.com/office/drawing/2016/ink" xmlns:am3d="http://schemas.microsoft.com/office/drawing/2017/model3d" xmlns:o="urn:schemas-microsoft-com:office:office" xmlns:oel="http://schemas.microsoft.com/office/2019/extlst" xmlns:r="http://schemas.openxmlformats.org/officeDocument/2006/relationships" xmlns:m="http://schemas.openxmlformats.org/officeDocument/2006/math" xmlns:v="urn:schemas-microsoft-com:vml" xmlns:wp14="http://schemas.microsoft.com/office/word/2010/wordprocessingDrawing" xmlns:wp="http://schemas.openxmlformats.org/drawingml/2006/wordprocessingDrawing" xmlns:w10="urn:schemas-microsoft-com:office:word" xmlns:w="http://schemas.openxmlformats.org/wordprocessingml/2006/main" xmlns:w14="http://schemas.microsoft.com/office/word/2010/wordml" xmlns:w15="http://schemas.microsoft.com/office/word/2012/wordml" xmlns:w16cex="http://schemas.microsoft.com/office/word/2018/wordml/cex" xmlns:w16cid="http://schemas.microsoft.com/office/word/2016/wordml/cid" xmlns:w16="http://schemas.microsoft.com/office/word/2018/wordml" xmlns:w16du="http://schemas.microsoft.com/office/word/2023/wordml/word16du" xmlns:w16sdtdh="http://schemas.microsoft.com/office/word/2020/wordml/sdtdatahash" xmlns:w16sdtfl="http://schemas.microsoft.com/office/word/2024/wordml/sdtformatlock" xmlns:w16se="http://schemas.microsoft.com/office/word/2015/wordml/symex" xmlns:wpg="http://schemas.microsoft.com/office/word/2010/wordprocessingGroup" xmlns:wpi="http://schemas.microsoft.com/office/word/2010/wordprocessingInk" xmlns:wne="http://schemas.microsoft.com/office/word/2006/wordml" xmlns:wps="http://schemas.microsoft.com/office/word/2010/wordprocessingShape" mc:Ignorable="w14 w15 w16se w16cid w16 w16cex w16sdtdh w16sdtfl w16du wp14">
+  <w:p>
+    <w:pPr>
+      <w:pStyle w:val="Footer"/>
+    </w:pPr>
+  </w:p>
+</w:ftr>
+</file>
+
+<file path=word/footer2.xml><?xml version="1.0" encoding="utf-8"?>
+<w:ftr xmlns:wpc="http://schemas.microsoft.com/office/word/2010/wordprocessingCanvas" xmlns:cx="http://schemas.microsoft.com/office/drawing/2014/chartex" xmlns:cx1="http://schemas.microsoft.com/office/drawing/2015/9/8/chartex" xmlns:cx2="http://schemas.microsoft.com/office/drawing/2015/10/21/chartex" xmlns:cx3="http://schemas.microsoft.com/office/drawing/2016/5/9/chartex" xmlns:cx4="http://schemas.microsoft.com/office/drawing/2016/5/10/chartex" xmlns:cx5="http://schemas.microsoft.com/office/drawing/2016/5/11/chartex" xmlns:cx6="http://schemas.microsoft.com/office/drawing/2016/5/12/chartex" xmlns:cx7="http://schemas.microsoft.com/office/drawing/2016/5/13/chartex" xmlns:cx8="http://schemas.microsoft.com/office/drawing/2016/5/14/chartex" xmlns:mc="http://schemas.openxmlformats.org/markup-compatibility/2006" xmlns:aink="http://schemas.microsoft.com/office/drawing/2016/ink" xmlns:am3d="http://schemas.microsoft.com/office/drawing/2017/model3d" xmlns:o="urn:schemas-microsoft-com:office:office" xmlns:oel="http://schemas.microsoft.com/office/2019/extlst" xmlns:r="http://schemas.openxmlformats.org/officeDocument/2006/relationships" xmlns:m="http://schemas.openxmlformats.org/officeDocument/2006/math" xmlns:v="urn:schemas-microsoft-com:vml" xmlns:wp14="http://schemas.microsoft.com/office/word/2010/wordprocessingDrawing" xmlns:wp="http://schemas.openxmlformats.org/drawingml/2006/wordprocessingDrawing" xmlns:w10="urn:schemas-microsoft-com:office:word" xmlns:w="http://schemas.openxmlformats.org/wordprocessingml/2006/main" xmlns:w14="http://schemas.microsoft.com/office/word/2010/wordml" xmlns:w15="http://schemas.microsoft.com/office/word/2012/wordml" xmlns:w16cex="http://schemas.microsoft.com/office/word/2018/wordml/cex" xmlns:w16cid="http://schemas.microsoft.com/office/word/2016/wordml/cid" xmlns:w16="http://schemas.microsoft.com/office/word/2018/wordml" xmlns:w16du="http://schemas.microsoft.com/office/word/2023/wordml/word16du" xmlns:w16sdtdh="http://schemas.microsoft.com/office/word/2020/wordml/sdtdatahash" xmlns:w16sdtfl="http://schemas.microsoft.com/office/word/2024/wordml/sdtformatlock" xmlns:w16se="http://schemas.microsoft.com/office/word/2015/wordml/symex" xmlns:wpg="http://schemas.microsoft.com/office/word/2010/wordprocessingGroup" xmlns:wpi="http://schemas.microsoft.com/office/word/2010/wordprocessingInk" xmlns:wne="http://schemas.microsoft.com/office/word/2006/wordml" xmlns:wps="http://schemas.microsoft.com/office/word/2010/wordprocessingShape" mc:Ignorable="w14 w15 w16se w16cid w16 w16cex w16sdtdh w16sdtfl w16du wp14">
+  <w:p>
+    <w:pPr>
+      <w:pStyle w:val="Footer"/>
+      <w:jc w:val="center"/>
+      <w:rPr>
+        <w:sz w:val="22"/>
+      </w:rPr>
+    </w:pPr>
+    <w:r>
+      <w:rPr>
+        <w:sz w:val="22"/>
+      </w:rPr>
+      <w:fldChar w:fldCharType="begin"/>
+    </w:r>
+    <w:r>
+      <w:rPr>
+        <w:sz w:val="22"/>
+      </w:rPr>
+      <w:instrText xml:space="preserve"> PAGE  \* MERGEFORMAT </w:instrText>
+    </w:r>
+    <w:r>
+      <w:rPr>
+        <w:sz w:val="22"/>
+      </w:rPr>
+      <w:fldChar w:fldCharType="separate"/>
+    </w:r>
+    <w:r>
+      <w:rPr>
+        <w:noProof/>
+        <w:sz w:val="22"/>
+      </w:rPr>
+      <w:t>1</w:t>
+    </w:r>
+    <w:r>
+      <w:rPr>
+        <w:sz w:val="22"/>
+      </w:rPr>
+      <w:fldChar w:fldCharType="end"/>
+    </w:r>
+  </w:p>
+</w:ftr>
+</file>
+
+<file path=word/footer3.xml><?xml version="1.0" encoding="utf-8"?>
+<w:ftr xmlns:wpc="http://schemas.microsoft.com/office/word/2010/wordprocessingCanvas" xmlns:cx="http://schemas.microsoft.com/office/drawing/2014/chartex" xmlns:cx1="http://schemas.microsoft.com/office/drawing/2015/9/8/chartex" xmlns:cx2="http://schemas.microsoft.com/office/drawing/2015/10/21/chartex" xmlns:cx3="http://schemas.microsoft.com/office/drawing/2016/5/9/chartex" xmlns:cx4="http://schemas.microsoft.com/office/drawing/2016/5/10/chartex" xmlns:cx5="http://schemas.microsoft.com/office/drawing/2016/5/11/chartex" xmlns:cx6="http://schemas.microsoft.com/office/drawing/2016/5/12/chartex" xmlns:cx7="http://schemas.microsoft.com/office/drawing/2016/5/13/chartex" xmlns:cx8="http://schemas.microsoft.com/office/drawing/2016/5/14/chartex" xmlns:mc="http://schemas.openxmlformats.org/markup-compatibility/2006" xmlns:aink="http://schemas.microsoft.com/office/drawing/2016/ink" xmlns:am3d="http://schemas.microsoft.com/office/drawing/2017/model3d" xmlns:o="urn:schemas-microsoft-com:office:office" xmlns:oel="http://schemas.microsoft.com/office/2019/extlst" xmlns:r="http://schemas.openxmlformats.org/officeDocument/2006/relationships" xmlns:m="http://schemas.openxmlformats.org/officeDocument/2006/math" xmlns:v="urn:schemas-microsoft-com:vml" xmlns:wp14="http://schemas.microsoft.com/office/word/2010/wordprocessingDrawing" xmlns:wp="http://schemas.openxmlformats.org/drawingml/2006/wordprocessingDrawing" xmlns:w10="urn:schemas-microsoft-com:office:word" xmlns:w="http://schemas.openxmlformats.org/wordprocessingml/2006/main" xmlns:w14="http://schemas.microsoft.com/office/word/2010/wordml" xmlns:w15="http://schemas.microsoft.com/office/word/2012/wordml" xmlns:w16cex="http://schemas.microsoft.com/office/word/2018/wordml/cex" xmlns:w16cid="http://schemas.microsoft.com/office/word/2016/wordml/cid" xmlns:w16="http://schemas.microsoft.com/office/word/2018/wordml" xmlns:w16du="http://schemas.microsoft.com/office/word/2023/wordml/word16du" xmlns:w16sdtdh="http://schemas.microsoft.com/office/word/2020/wordml/sdtdatahash" xmlns:w16sdtfl="http://schemas.microsoft.com/office/word/2024/wordml/sdtformatlock" xmlns:w16se="http://schemas.microsoft.com/office/word/2015/wordml/symex" xmlns:wpg="http://schemas.microsoft.com/office/word/2010/wordprocessingGroup" xmlns:wpi="http://schemas.microsoft.com/office/word/2010/wordprocessingInk" xmlns:wne="http://schemas.microsoft.com/office/word/2006/wordml" xmlns:wps="http://schemas.microsoft.com/office/word/2010/wordprocessingShape" mc:Ignorable="w14 w15 w16se w16cid w16 w16cex w16sdtdh w16sdtfl w16du wp14">
+  <w:p>
+    <w:pPr>
+      <w:pStyle w:val="Footer"/>
+    </w:pPr>
+  </w:p>
+</w:ftr>
+</file>
+
+<file path=word/footnotes.xml><?xml version="1.0" encoding="utf-8"?>
+<w:footnotes xmlns:wpc="http://schemas.microsoft.com/office/word/2010/wordprocessingCanvas" xmlns:cx="http://schemas.microsoft.com/office/drawing/2014/chartex" xmlns:cx1="http://schemas.microsoft.com/office/drawing/2015/9/8/chartex" xmlns:cx2="http://schemas.microsoft.com/office/drawing/2015/10/21/chartex" xmlns:cx3="http://schemas.microsoft.com/office/drawing/2016/5/9/chartex" xmlns:cx4="http://schemas.microsoft.com/office/drawing/2016/5/10/chartex" xmlns:cx5="http://schemas.microsoft.com/office/drawing/2016/5/11/chartex" xmlns:cx6="http://schemas.microsoft.com/office/drawing/2016/5/12/chartex" xmlns:cx7="http://schemas.microsoft.com/office/drawing/2016/5/13/chartex" xmlns:cx8="http://schemas.microsoft.com/office/drawing/2016/5/14/chartex" xmlns:mc="http://schemas.openxmlformats.org/markup-compatibility/2006" xmlns:aink="http://schemas.microsoft.com/office/drawing/2016/ink" xmlns:am3d="http://schemas.microsoft.com/office/drawing/2017/model3d" xmlns:o="urn:schemas-microsoft-com:office:office" xmlns:oel="http://schemas.microsoft.com/office/2019/extlst" xmlns:r="http://schemas.openxmlformats.org/officeDocument/2006/relationships" xmlns:m="http://schemas.openxmlformats.org/officeDocument/2006/math" xmlns:v="urn:schemas-microsoft-com:vml" xmlns:wp14="http://schemas.microsoft.com/office/word/2010/wordprocessingDrawing" xmlns:wp="http://schemas.openxmlformats.org/drawingml/2006/wordprocessingDrawing" xmlns:w10="urn:schemas-microsoft-com:office:word" xmlns:w="http://schemas.openxmlformats.org/wordprocessingml/2006/main" xmlns:w14="http://schemas.microsoft.com/office/word/2010/wordml" xmlns:w15="http://schemas.microsoft.com/office/word/2012/wordml" xmlns:w16cex="http://schemas.microsoft.com/office/word/2018/wordml/cex" xmlns:w16cid="http://schemas.microsoft.com/office/word/2016/wordml/cid" xmlns:w16="http://schemas.microsoft.com/office/word/2018/wordml" xmlns:w16du="http://schemas.microsoft.com/office/word/2023/wordml/word16du" xmlns:w16sdtdh="http://schemas.microsoft.com/office/word/2020/wordml/sdtdatahash" xmlns:w16sdtfl="http://schemas.microsoft.com/office/word/2024/wordml/sdtformatlock" xmlns:w16se="http://schemas.microsoft.com/office/word/2015/wordml/symex" xmlns:wpg="http://schemas.microsoft.com/office/word/2010/wordprocessingGroup" xmlns:wpi="http://schemas.microsoft.com/office/word/2010/wordprocessingInk" xmlns:wne="http://schemas.microsoft.com/office/word/2006/wordml" xmlns:wps="http://schemas.microsoft.com/office/word/2010/wordprocessingShape" mc:Ignorable="w14 w15 w16se w16cid w16 w16cex w16sdtdh w16sdtfl w16du wp14">
+  <w:footnote w:type="separator" w:id="-1">
+    <w:p>
+      <w:r>
+        <w:separator/>
+      </w:r>
+    </w:p>
+  </w:footnote>
+  <w:footnote w:type="continuationSeparator" w:id="0">
+    <w:p>
+      <w:r>
+        <w:continuationSeparator/>
+      </w:r>
+    </w:p>
+  </w:footnote>
+</w:footnotes>
+</file>
+
+<file path=word/header1.xml><?xml version="1.0" encoding="utf-8"?>
+<w:hdr xmlns:wpc="http://schemas.microsoft.com/office/word/2010/wordprocessingCanvas" xmlns:cx="http://schemas.microsoft.com/office/drawing/2014/chartex" xmlns:cx1="http://schemas.microsoft.com/office/drawing/2015/9/8/chartex" xmlns:cx2="http://schemas.microsoft.com/office/drawing/2015/10/21/chartex" xmlns:cx3="http://schemas.microsoft.com/office/drawing/2016/5/9/chartex" xmlns:cx4="http://schemas.microsoft.com/office/drawing/2016/5/10/chartex" xmlns:cx5="http://schemas.microsoft.com/office/drawing/2016/5/11/chartex" xmlns:cx6="http://schemas.microsoft.com/office/drawing/2016/5/12/chartex" xmlns:cx7="http://schemas.microsoft.com/office/drawing/2016/5/13/chartex" xmlns:cx8="http://schemas.microsoft.com/office/drawing/2016/5/14/chartex" xmlns:mc="http://schemas.openxmlformats.org/markup-compatibility/2006" xmlns:aink="http://schemas.microsoft.com/office/drawing/2016/ink" xmlns:am3d="http://schemas.microsoft.com/office/drawing/2017/model3d" xmlns:o="urn:schemas-microsoft-com:office:office" xmlns:oel="http://schemas.microsoft.com/office/2019/extlst" xmlns:r="http://schemas.openxmlformats.org/officeDocument/2006/relationships" xmlns:m="http://schemas.openxmlformats.org/officeDocument/2006/math" xmlns:v="urn:schemas-microsoft-com:vml" xmlns:wp14="http://schemas.microsoft.com/office/word/2010/wordprocessingDrawing" xmlns:wp="http://schemas.openxmlformats.org/drawingml/2006/wordprocessingDrawing" xmlns:w10="urn:schemas-microsoft-com:office:word" xmlns:w="http://schemas.openxmlformats.org/wordprocessingml/2006/main" xmlns:w14="http://schemas.microsoft.com/office/word/2010/wordml" xmlns:w15="http://schemas.microsoft.com/office/word/2012/wordml" xmlns:w16cex="http://schemas.microsoft.com/office/word/2018/wordml/cex" xmlns:w16cid="http://schemas.microsoft.com/office/word/2016/wordml/cid" xmlns:w16="http://schemas.microsoft.com/office/word/2018/wordml" xmlns:w16du="http://schemas.microsoft.com/office/word/2023/wordml/word16du" xmlns:w16sdtdh="http://schemas.microsoft.com/office/word/2020/wordml/sdtdatahash" xmlns:w16sdtfl="http://schemas.microsoft.com/office/word/2024/wordml/sdtformatlock" xmlns:w16se="http://schemas.microsoft.com/office/word/2015/wordml/symex" xmlns:wpg="http://schemas.microsoft.com/office/word/2010/wordprocessingGroup" xmlns:wpi="http://schemas.microsoft.com/office/word/2010/wordprocessingInk" xmlns:wne="http://schemas.microsoft.com/office/word/2006/wordml" xmlns:wps="http://schemas.microsoft.com/office/word/2010/wordprocessingShape" mc:Ignorable="w14 w15 w16se w16cid w16 w16cex w16sdtdh w16sdtfl w16du wp14">
+  <w:p>
+    <w:pPr>
+      <w:pStyle w:val="Header"/>
+    </w:pPr>
+  </w:p>
+</w:hdr>
+</file>
+
+<file path=word/header2.xml><?xml version="1.0" encoding="utf-8"?>
+<w:hdr xmlns:wpc="http://schemas.microsoft.com/office/word/2010/wordprocessingCanvas" xmlns:cx="http://schemas.microsoft.com/office/drawing/2014/chartex" xmlns:cx1="http://schemas.microsoft.com/office/drawing/2015/9/8/chartex" xmlns:cx2="http://schemas.microsoft.com/office/drawing/2015/10/21/chartex" xmlns:cx3="http://schemas.microsoft.com/office/drawing/2016/5/9/chartex" xmlns:cx4="http://schemas.microsoft.com/office/drawing/2016/5/10/chartex" xmlns:cx5="http://schemas.microsoft.com/office/drawing/2016/5/11/chartex" xmlns:cx6="http://schemas.microsoft.com/office/drawing/2016/5/12/chartex" xmlns:cx7="http://schemas.microsoft.com/office/drawing/2016/5/13/chartex" xmlns:cx8="http://schemas.microsoft.com/office/drawing/2016/5/14/chartex" xmlns:mc="http://schemas.openxmlformats.org/markup-compatibility/2006" xmlns:aink="http://schemas.microsoft.com/office/drawing/2016/ink" xmlns:am3d="http://schemas.microsoft.com/office/drawing/2017/model3d" xmlns:o="urn:schemas-microsoft-com:office:office" xmlns:oel="http://schemas.microsoft.com/office/2019/extlst" xmlns:r="http://schemas.openxmlformats.org/officeDocument/2006/relationships" xmlns:m="http://schemas.openxmlformats.org/officeDocument/2006/math" xmlns:v="urn:schemas-microsoft-com:vml" xmlns:wp14="http://schemas.microsoft.com/office/word/2010/wordprocessingDrawing" xmlns:wp="http://schemas.openxmlformats.org/drawingml/2006/wordprocessingDrawing" xmlns:w10="urn:schemas-microsoft-com:office:word" xmlns:w="http://schemas.openxmlformats.org/wordprocessingml/2006/main" xmlns:w14="http://schemas.microsoft.com/office/word/2010/wordml" xmlns:w15="http://schemas.microsoft.com/office/word/2012/wordml" xmlns:w16cex="http://schemas.microsoft.com/office/word/2018/wordml/cex" xmlns:w16cid="http://schemas.microsoft.com/office/word/2016/wordml/cid" xmlns:w16="http://schemas.microsoft.com/office/word/2018/wordml" xmlns:w16du="http://schemas.microsoft.com/office/word/2023/wordml/word16du" xmlns:w16sdtdh="http://schemas.microsoft.com/office/word/2020/wordml/sdtdatahash" xmlns:w16sdtfl="http://schemas.microsoft.com/office/word/2024/wordml/sdtformatlock" xmlns:w16se="http://schemas.microsoft.com/office/word/2015/wordml/symex" xmlns:wpg="http://schemas.microsoft.com/office/word/2010/wordprocessingGroup" xmlns:wpi="http://schemas.microsoft.com/office/word/2010/wordprocessingInk" xmlns:wne="http://schemas.microsoft.com/office/word/2006/wordml" xmlns:wps="http://schemas.microsoft.com/office/word/2010/wordprocessingShape" mc:Ignorable="w14 w15 w16se w16cid w16 w16cex w16sdtdh w16sdtfl w16du wp14">
+  <w:p>
+    <w:pPr>
+      <w:pStyle w:val="Header"/>
+    </w:pPr>
+  </w:p>
+</w:hdr>
+</file>
+
+<file path=word/header3.xml><?xml version="1.0" encoding="utf-8"?>
+<w:hdr xmlns:wpc="http://schemas.microsoft.com/office/word/2010/wordprocessingCanvas" xmlns:cx="http://schemas.microsoft.com/office/drawing/2014/chartex" xmlns:cx1="http://schemas.microsoft.com/office/drawing/2015/9/8/chartex" xmlns:cx2="http://schemas.microsoft.com/office/drawing/2015/10/21/chartex" xmlns:cx3="http://schemas.microsoft.com/office/drawing/2016/5/9/chartex" xmlns:cx4="http://schemas.microsoft.com/office/drawing/2016/5/10/chartex" xmlns:cx5="http://schemas.microsoft.com/office/drawing/2016/5/11/chartex" xmlns:cx6="http://schemas.microsoft.com/office/drawing/2016/5/12/chartex" xmlns:cx7="http://schemas.microsoft.com/office/drawing/2016/5/13/chartex" xmlns:cx8="http://schemas.microsoft.com/office/drawing/2016/5/14/chartex" xmlns:mc="http://schemas.openxmlformats.org/markup-compatibility/2006" xmlns:aink="http://schemas.microsoft.com/office/drawing/2016/ink" xmlns:am3d="http://schemas.microsoft.com/office/drawing/2017/model3d" xmlns:o="urn:schemas-microsoft-com:office:office" xmlns:oel="http://schemas.microsoft.com/office/2019/extlst" xmlns:r="http://schemas.openxmlformats.org/officeDocument/2006/relationships" xmlns:m="http://schemas.openxmlformats.org/officeDocument/2006/math" xmlns:v="urn:schemas-microsoft-com:vml" xmlns:wp14="http://schemas.microsoft.com/office/word/2010/wordprocessingDrawing" xmlns:wp="http://schemas.openxmlformats.org/drawingml/2006/wordprocessingDrawing" xmlns:w10="urn:schemas-microsoft-com:office:word" xmlns:w="http://schemas.openxmlformats.org/wordprocessingml/2006/main" xmlns:w14="http://schemas.microsoft.com/office/word/2010/wordml" xmlns:w15="http://schemas.microsoft.com/office/word/2012/wordml" xmlns:w16cex="http://schemas.microsoft.com/office/word/2018/wordml/cex" xmlns:w16cid="http://schemas.microsoft.com/office/word/2016/wordml/cid" xmlns:w16="http://schemas.microsoft.com/office/word/2018/wordml" xmlns:w16du="http://schemas.microsoft.com/office/word/2023/wordml/word16du" xmlns:w16sdtdh="http://schemas.microsoft.com/office/word/2020/wordml/sdtdatahash" xmlns:w16sdtfl="http://schemas.microsoft.com/office/word/2024/wordml/sdtformatlock" xmlns:w16se="http://schemas.microsoft.com/office/word/2015/wordml/symex" xmlns:wpg="http://schemas.microsoft.com/office/word/2010/wordprocessingGroup" xmlns:wpi="http://schemas.microsoft.com/office/word/2010/wordprocessingInk" xmlns:wne="http://schemas.microsoft.com/office/word/2006/wordml" xmlns:wps="http://schemas.microsoft.com/office/word/2010/wordprocessingShape" mc:Ignorable="w14 w15 w16se w16cid w16 w16cex w16sdtdh w16sdtfl w16du wp14">
+  <w:p>
+    <w:pPr>
+      <w:pStyle w:val="Header"/>
+    </w:pPr>
+  </w:p>
+</w:hdr>
 </file>
 
 <file path=word/numbering.xml><?xml version="1.0" encoding="utf-8"?>
@@ -36892,6 +37032,58 @@
       <w:ind w:left="480"/>
     </w:pPr>
   </w:style>
+  <w:style w:type="paragraph" w:styleId="Header">
+    <w:name w:val="header"/>
+    <w:basedOn w:val="Normal"/>
+    <w:link w:val="HeaderChar"/>
+    <w:uiPriority w:val="99"/>
+    <w:unhideWhenUsed/>
+    <w:rsid w:val="002B6A30"/>
+    <w:pPr>
+      <w:tabs>
+        <w:tab w:val="center" w:pos="4513"/>
+        <w:tab w:val="right" w:pos="9026"/>
+      </w:tabs>
+    </w:pPr>
+  </w:style>
+  <w:style w:type="character" w:customStyle="1" w:styleId="HeaderChar">
+    <w:name w:val="Header Char"/>
+    <w:basedOn w:val="DefaultParagraphFont"/>
+    <w:link w:val="Header"/>
+    <w:uiPriority w:val="99"/>
+    <w:rsid w:val="002B6A30"/>
+    <w:rPr>
+      <w:rFonts w:eastAsiaTheme="minorEastAsia"/>
+      <w:sz w:val="24"/>
+      <w:szCs w:val="24"/>
+    </w:rPr>
+  </w:style>
+  <w:style w:type="paragraph" w:styleId="Footer">
+    <w:name w:val="footer"/>
+    <w:basedOn w:val="Normal"/>
+    <w:link w:val="FooterChar"/>
+    <w:uiPriority w:val="99"/>
+    <w:unhideWhenUsed/>
+    <w:rsid w:val="002B6A30"/>
+    <w:pPr>
+      <w:tabs>
+        <w:tab w:val="center" w:pos="4513"/>
+        <w:tab w:val="right" w:pos="9026"/>
+      </w:tabs>
+    </w:pPr>
+  </w:style>
+  <w:style w:type="character" w:customStyle="1" w:styleId="FooterChar">
+    <w:name w:val="Footer Char"/>
+    <w:basedOn w:val="DefaultParagraphFont"/>
+    <w:link w:val="Footer"/>
+    <w:uiPriority w:val="99"/>
+    <w:rsid w:val="002B6A30"/>
+    <w:rPr>
+      <w:rFonts w:eastAsiaTheme="minorEastAsia"/>
+      <w:sz w:val="24"/>
+      <w:szCs w:val="24"/>
+    </w:rPr>
+  </w:style>
 </w:styles>
 </file>
 

</xml_diff>